<commit_message>
Beta feedback round (APickering) and app-wide em dash removal
Feedback fixes: sticky compacting navbar, statistical glossary on the
Definitions tab, distribution/param_type edit validation with snap-back,
double-click wording, MoE defined at first use, grey tornado bars
explained, IPCC Inventory Software note and Word-summary blurb on the
IPCC Report tab, reproducibility note on Simulate, corrected tab
numbering (6 Sensitivity / 7 IPCC Report), QA/QC "where to document"
wording.

Em dashes removed everywhere per style rule (UI strings EN/FR, template
guides, exports, translator prompts, doc sources incl. pandoc --- / --
forms, defaults CSVs, comments); paired-dash asides repaired by hand.
Rebuilt: methodology + user guide (pdf/docx), help pages, translator
kit, feedback guide, blank feedback template. Audit 120/120.

Co-Authored-By: Claude Fable 5 <noreply@anthropic.com>
</commit_message>
<xml_diff>
--- a/documentation/beta_test/feedback_guide.docx
+++ b/documentation/beta_test/feedback_guide.docx
@@ -15,7 +15,7 @@
         <w:pStyle w:val="Subtitle"/>
       </w:pPr>
       <w:r>
-        <w:t xml:space="preserve">Beta Testing — How to Review the Tool and Send Feedback</w:t>
+        <w:t xml:space="preserve">Beta Testing, How to Review the Tool and Send Feedback</w:t>
       </w:r>
     </w:p>
     <w:p>
@@ -23,7 +23,7 @@
         <w:pStyle w:val="Author"/>
       </w:pPr>
       <w:r>
-        <w:t xml:space="preserve">CIAT / CGIAR Alliance — ClimateActionNetZero</w:t>
+        <w:t xml:space="preserve">CIAT / CGIAR Alliance, ClimateActionNetZero</w:t>
       </w:r>
     </w:p>
     <w:bookmarkStart w:id="18" w:name="Xf3e03862b7d0ad98d6ae81edd251eb587a4731b"/>
@@ -32,7 +32,7 @@
         <w:pStyle w:val="Heading1"/>
       </w:pPr>
       <w:r>
-        <w:t xml:space="preserve">Help us improve the tool — a 20-minute review</w:t>
+        <w:t xml:space="preserve">Help us improve the tool: a 20-minute review</w:t>
       </w:r>
     </w:p>
     <w:p>
@@ -66,7 +66,7 @@
         <w:t xml:space="preserve">20–30 minutes</w:t>
       </w:r>
       <w:r>
-        <w:t xml:space="preserve">. You don’t need to be an R user or install anything — the tool runs in your web browser.</w:t>
+        <w:t xml:space="preserve">. You don’t need to be an R user or install anything: the tool runs in your web browser.</w:t>
       </w:r>
     </w:p>
     <w:bookmarkStart w:id="9" w:name="what-youll-need"/>
@@ -119,10 +119,7 @@
         <w:t xml:space="preserve">beta_sample_inventory.xlsx</w:t>
       </w:r>
       <w:r>
-        <w:t xml:space="preserve"> </w:t>
-      </w:r>
-      <w:r>
-        <w:t xml:space="preserve">— a small practice dataset to load into the tool.</w:t>
+        <w:t xml:space="preserve">: a small practice dataset to load into the tool.</w:t>
       </w:r>
     </w:p>
     <w:p>
@@ -142,10 +139,7 @@
         <w:t xml:space="preserve">beta_feedback_template.xlsx</w:t>
       </w:r>
       <w:r>
-        <w:t xml:space="preserve"> </w:t>
-      </w:r>
-      <w:r>
-        <w:t xml:space="preserve">— the form where you write your feedback.</w:t>
+        <w:t xml:space="preserve">: the form where you write your feedback.</w:t>
       </w:r>
     </w:p>
     <w:p>
@@ -171,7 +165,7 @@
         <w:pStyle w:val="Heading2"/>
       </w:pPr>
       <w:r>
-        <w:t xml:space="preserve">Step 1 — Open the tool</w:t>
+        <w:t xml:space="preserve">Step 1: Open the tool</w:t>
       </w:r>
     </w:p>
     <w:p>
@@ -195,7 +189,7 @@
         </w:r>
       </w:hyperlink>
       <w:r>
-        <w:t xml:space="preserve">. The calculator opens straight away —</w:t>
+        <w:t xml:space="preserve">. The calculator opens straight away,</w:t>
       </w:r>
       <w:r>
         <w:t xml:space="preserve"> </w:t>
@@ -234,7 +228,7 @@
         <w:pStyle w:val="Heading2"/>
       </w:pPr>
       <w:r>
-        <w:t xml:space="preserve">Step 2 — Load the practice dataset</w:t>
+        <w:t xml:space="preserve">Step 2: Load the practice dataset</w:t>
       </w:r>
       <w:r>
         <w:t xml:space="preserve"> </w:t>
@@ -390,7 +384,7 @@
         <w:t xml:space="preserve"> </w:t>
       </w:r>
       <w:r>
-        <w:t xml:space="preserve">to include — start with all of them (enteric CH</w:t>
+        <w:t xml:space="preserve">to include: start with all of them (enteric CH</w:t>
       </w:r>
       <w:r>
         <w:rPr>
@@ -467,7 +461,7 @@
         <w:pStyle w:val="Heading2"/>
       </w:pPr>
       <w:r>
-        <w:t xml:space="preserve">Step 3 — Walk through the tabs</w:t>
+        <w:t xml:space="preserve">Step 3: Walk through the tabs</w:t>
       </w:r>
       <w:r>
         <w:t xml:space="preserve"> </w:t>
@@ -517,10 +511,7 @@
         <w:t xml:space="preserve">QA/QC</w:t>
       </w:r>
       <w:r>
-        <w:t xml:space="preserve"> </w:t>
-      </w:r>
-      <w:r>
-        <w:t xml:space="preserve">— the automatic data checks and any flags they raise.</w:t>
+        <w:t xml:space="preserve">: the automatic data checks and any flags they raise.</w:t>
       </w:r>
     </w:p>
     <w:p>
@@ -539,10 +530,7 @@
         <w:t xml:space="preserve">Uncertainty</w:t>
       </w:r>
       <w:r>
-        <w:t xml:space="preserve"> </w:t>
-      </w:r>
-      <w:r>
-        <w:t xml:space="preserve">— the ± ranges shown for each parameter.</w:t>
+        <w:t xml:space="preserve">: the ± ranges shown for each parameter.</w:t>
       </w:r>
     </w:p>
     <w:p>
@@ -561,10 +549,7 @@
         <w:t xml:space="preserve">Correlations</w:t>
       </w:r>
       <w:r>
-        <w:t xml:space="preserve"> </w:t>
-      </w:r>
-      <w:r>
-        <w:t xml:space="preserve">— how parameters move together (the practice file includes multi-year data, so this tab has something to display).</w:t>
+        <w:t xml:space="preserve">: how parameters move together (the practice file includes multi-year data, so this tab has something to display).</w:t>
       </w:r>
     </w:p>
     <w:p>
@@ -583,10 +568,7 @@
         <w:t xml:space="preserve">Simulate</w:t>
       </w:r>
       <w:r>
-        <w:t xml:space="preserve"> </w:t>
-      </w:r>
-      <w:r>
-        <w:t xml:space="preserve">— run the Monte Carlo simulation; look at the totals and the distribution chart.</w:t>
+        <w:t xml:space="preserve">: run the Monte Carlo simulation; look at the totals and the distribution chart.</w:t>
       </w:r>
     </w:p>
     <w:p>
@@ -605,10 +587,7 @@
         <w:t xml:space="preserve">Sensitivity</w:t>
       </w:r>
       <w:r>
-        <w:t xml:space="preserve"> </w:t>
-      </w:r>
-      <w:r>
-        <w:t xml:space="preserve">— which inputs drive most of the uncertainty (the tornado chart).</w:t>
+        <w:t xml:space="preserve">: which inputs drive most of the uncertainty (the tornado chart).</w:t>
       </w:r>
     </w:p>
     <w:p>
@@ -627,10 +606,7 @@
         <w:t xml:space="preserve">IPCC Report</w:t>
       </w:r>
       <w:r>
-        <w:t xml:space="preserve"> </w:t>
-      </w:r>
-      <w:r>
-        <w:t xml:space="preserve">— the summary tables and the downloadable Word report.</w:t>
+        <w:t xml:space="preserve">: the summary tables and the downloadable Word report.</w:t>
       </w:r>
     </w:p>
     <w:p>
@@ -648,7 +624,7 @@
         <w:pStyle w:val="Heading2"/>
       </w:pPr>
       <w:r>
-        <w:t xml:space="preserve">Step 4 — Record your feedback</w:t>
+        <w:t xml:space="preserve">Step 4: Record your feedback</w:t>
       </w:r>
       <w:r>
         <w:t xml:space="preserve"> </w:t>
@@ -734,10 +710,7 @@
         <w:t xml:space="preserve">Tab</w:t>
       </w:r>
       <w:r>
-        <w:t xml:space="preserve"> </w:t>
-      </w:r>
-      <w:r>
-        <w:t xml:space="preserve">— where you saw it (Home, Data Input, QA/QC, …, Contact).</w:t>
+        <w:t xml:space="preserve">: where you saw it (Home, Data Input, QA/QC, …, Contact).</w:t>
       </w:r>
     </w:p>
     <w:p>
@@ -772,10 +745,7 @@
         <w:t xml:space="preserve">Severity</w:t>
       </w:r>
       <w:r>
-        <w:t xml:space="preserve"> </w:t>
-      </w:r>
-      <w:r>
-        <w:t xml:space="preserve">— see the tables below.</w:t>
+        <w:t xml:space="preserve">: see the tables below.</w:t>
       </w:r>
     </w:p>
     <w:p>
@@ -794,10 +764,7 @@
         <w:t xml:space="preserve">Description</w:t>
       </w:r>
       <w:r>
-        <w:t xml:space="preserve"> </w:t>
-      </w:r>
-      <w:r>
-        <w:t xml:space="preserve">— what you observed and what you expected instead.</w:t>
+        <w:t xml:space="preserve">: what you observed and what you expected instead.</w:t>
       </w:r>
     </w:p>
     <w:p>
@@ -816,10 +783,7 @@
         <w:t xml:space="preserve">Suggested fix / comment</w:t>
       </w:r>
       <w:r>
-        <w:t xml:space="preserve"> </w:t>
-      </w:r>
-      <w:r>
-        <w:t xml:space="preserve">— optional; your idea for the right behaviour.</w:t>
+        <w:t xml:space="preserve">: optional; your idea for the right behaviour.</w:t>
       </w:r>
     </w:p>
     <w:p>
@@ -843,7 +807,7 @@
         <w:t xml:space="preserve"> </w:t>
       </w:r>
       <w:r>
-        <w:t xml:space="preserve">column blank — the development team fills that in as items are addressed.</w:t>
+        <w:t xml:space="preserve">column blank: the development team fills that in as items are addressed.</w:t>
       </w:r>
     </w:p>
     <w:tbl>
@@ -941,7 +905,7 @@
               <w:jc w:val="left"/>
             </w:pPr>
             <w:r>
-              <w:t xml:space="preserve">Something is factually wrong — a method, equation, IPCC reference, or number</w:t>
+              <w:t xml:space="preserve">Something is factually wrong: a method, equation, IPCC reference, or number</w:t>
             </w:r>
           </w:p>
         </w:tc>
@@ -1073,7 +1037,7 @@
               <w:jc w:val="left"/>
             </w:pPr>
             <w:r>
-              <w:t xml:space="preserve">Must fix before release — a calculation error or crash</w:t>
+              <w:t xml:space="preserve">Must fix before release: a calculation error or crash</w:t>
             </w:r>
           </w:p>
         </w:tc>
@@ -1103,7 +1067,7 @@
               <w:jc w:val="left"/>
             </w:pPr>
             <w:r>
-              <w:t xml:space="preserve">Should fix before release — a significant accuracy or usability issue</w:t>
+              <w:t xml:space="preserve">Should fix before release: a significant accuracy or usability issue</w:t>
             </w:r>
           </w:p>
         </w:tc>
@@ -1133,7 +1097,7 @@
               <w:jc w:val="left"/>
             </w:pPr>
             <w:r>
-              <w:t xml:space="preserve">Can fix in the next iteration — a minor issue that doesn’t block use</w:t>
+              <w:t xml:space="preserve">Can fix in the next iteration: a minor issue that doesn’t block use</w:t>
             </w:r>
           </w:p>
         </w:tc>
@@ -1163,7 +1127,7 @@
               <w:jc w:val="left"/>
             </w:pPr>
             <w:r>
-              <w:t xml:space="preserve">Nice to have — cosmetic or very minor</w:t>
+              <w:t xml:space="preserve">Nice to have: cosmetic or very minor</w:t>
             </w:r>
           </w:p>
         </w:tc>
@@ -1176,7 +1140,7 @@
         <w:pStyle w:val="Heading2"/>
       </w:pPr>
       <w:r>
-        <w:t xml:space="preserve">Step 5 — Send it back</w:t>
+        <w:t xml:space="preserve">Step 5: Send it back</w:t>
       </w:r>
     </w:p>
     <w:p>
@@ -1227,7 +1191,7 @@
         <w:t xml:space="preserve">M.Lolita@cgiar.org</w:t>
       </w:r>
       <w:r>
-        <w:t xml:space="preserve">. If several people are reviewing, each can send their own file — the</w:t>
+        <w:t xml:space="preserve">. If several people are reviewing, each can send their own file: the</w:t>
       </w:r>
       <w:r>
         <w:t xml:space="preserve"> </w:t>
@@ -1376,10 +1340,7 @@
         <w:t xml:space="preserve">AI Translator</w:t>
       </w:r>
       <w:r>
-        <w:t xml:space="preserve"> </w:t>
-      </w:r>
-      <w:r>
-        <w:t xml:space="preserve">— it is</w:t>
+        <w:t xml:space="preserve">: it is</w:t>
       </w:r>
       <w:r>
         <w:t xml:space="preserve"> </w:t>
@@ -1424,10 +1385,7 @@
         <w:t xml:space="preserve">Be specific</w:t>
       </w:r>
       <w:r>
-        <w:t xml:space="preserve"> </w:t>
-      </w:r>
-      <w:r>
-        <w:t xml:space="preserve">— name the tab and the exact button, table, chart, or text.</w:t>
+        <w:t xml:space="preserve">: name the tab and the exact button, table, chart, or text.</w:t>
       </w:r>
     </w:p>
     <w:p>
@@ -1476,7 +1434,7 @@
         <w:pStyle w:val="FirstParagraph"/>
       </w:pPr>
       <w:r>
-        <w:t xml:space="preserve">Thank you — your review directly shapes what we fix before the tool is released more widely.</w:t>
+        <w:t xml:space="preserve">Thank you: your review directly shapes what we fix before the tool is released more widely.</w:t>
       </w:r>
     </w:p>
     <w:bookmarkEnd w:id="17"/>
@@ -3303,13 +3261,13 @@
 </file>
 
 <file path=customXml/itemProps1.xml><?xml version="1.0" encoding="utf-8"?>
-<ds:datastoreItem xmlns:ds="http://schemas.openxmlformats.org/officeDocument/2006/customXml" ds:itemID="{CADDE604-266F-45C0-8982-D69C50E03909}"/>
+<ds:datastoreItem xmlns:ds="http://schemas.openxmlformats.org/officeDocument/2006/customXml" ds:itemID="{D6F676C1-EE35-4B7C-A691-95CEBA0AE789}"/>
 </file>
 
 <file path=customXml/itemProps2.xml><?xml version="1.0" encoding="utf-8"?>
-<ds:datastoreItem xmlns:ds="http://schemas.openxmlformats.org/officeDocument/2006/customXml" ds:itemID="{AD9CE9BA-12E8-460E-A7F3-86A7B3890780}"/>
+<ds:datastoreItem xmlns:ds="http://schemas.openxmlformats.org/officeDocument/2006/customXml" ds:itemID="{851C6664-EB43-4E1D-B3FC-A4B939FC167A}"/>
 </file>
 
 <file path=customXml/itemProps3.xml><?xml version="1.0" encoding="utf-8"?>
-<ds:datastoreItem xmlns:ds="http://schemas.openxmlformats.org/officeDocument/2006/customXml" ds:itemID="{79554242-2CA9-4869-9453-75D79C08192D}"/>
+<ds:datastoreItem xmlns:ds="http://schemas.openxmlformats.org/officeDocument/2006/customXml" ds:itemID="{7DDD6202-4278-4850-8B6F-88DEFB3BDFD4}"/>
 </file>
</xml_diff>